<commit_message>
📄 DOCX firmado: CNM9812146G9 - 18/2/2026, 3:37:22 a.m.
</commit_message>
<xml_diff>
--- a/data/declaraciones/signed/CNM9812146G9.docx
+++ b/data/declaraciones/signed/CNM9812146G9.docx
@@ -4230,7 +4230,7 @@
         <w:rPr>
           <w:lang w:val="es-MX"/>
         </w:rPr>
-        <w:t xml:space="preserve">CONDE NAST DE MEXICO SA DE CV</w:t>
+        <w:t xml:space="preserve">Luis Manuel Balbuena Gonzalez</w:t>
       </w:r>
       <w:proofErr w:type="spellStart"/>
       <w:r>
@@ -4353,7 +4353,7 @@
         <w:rPr>
           <w:lang w:val="es-MX"/>
         </w:rPr>
-        <w:t xml:space="preserve">Fecha: 28 de enero de 2026</w:t>
+        <w:t xml:space="preserve">Fecha: 17 de febrero de 2026</w:t>
       </w:r>
       <w:proofErr w:type="spellStart"/>
       <w:r>

</xml_diff>